<commit_message>
feat: update case editing and portal resubmission flow
</commit_message>
<xml_diff>
--- a/templates/Plain AICS/PLAIN AICS.fixed.docx
+++ b/templates/Plain AICS/PLAIN AICS.fixed.docx
@@ -1148,6 +1148,15 @@
           <w:szCs w:val="23"/>
         </w:rPr>
       </w:pPr>
+    </w:p>
+    <w:p>
+      <w:pPr>
+        <w:pStyle w:val="NoSpacing"/>
+        <w:rPr>
+          <w:rFonts w:ascii="Arial" w:hAnsi="Arial" w:cs="Arial"/>
+          <w:b/>
+        </w:rPr>
+      </w:pPr>
       <w:r>
         <w:rPr>
           <w:rFonts w:ascii="Arial" w:hAnsi="Arial" w:cs="Arial"/>
@@ -1159,13 +1168,13 @@
         <mc:AlternateContent>
           <mc:Choice Requires="wps">
             <w:drawing>
-              <wp:anchor distT="45720" distB="45720" distL="114300" distR="114300" simplePos="0" relativeHeight="251662336" behindDoc="1" locked="0" layoutInCell="1" allowOverlap="1" wp14:anchorId="3CEFD057" wp14:editId="57187085">
+              <wp:anchor distT="45720" distB="45720" distL="114300" distR="114300" simplePos="0" relativeHeight="251663360" behindDoc="1" locked="0" layoutInCell="1" allowOverlap="1" wp14:anchorId="577D9C77" wp14:editId="08E874D9">
                 <wp:simplePos x="0" y="0"/>
                 <wp:positionH relativeFrom="column">
-                  <wp:posOffset>92098</wp:posOffset>
+                  <wp:posOffset>113030</wp:posOffset>
                 </wp:positionH>
                 <wp:positionV relativeFrom="paragraph">
-                  <wp:posOffset>157443</wp:posOffset>
+                  <wp:posOffset>635</wp:posOffset>
                 </wp:positionV>
                 <wp:extent cx="1525509" cy="1404620"/>
                 <wp:effectExtent l="0" t="0" r="17780" b="13970"/>
@@ -1249,11 +1258,11 @@
           </mc:Choice>
           <mc:Fallback>
             <w:pict>
-              <v:shapetype w14:anchorId="3CEFD057" id="_x0000_t202" coordsize="21600,21600" o:spt="202" path="m,l,21600r21600,l21600,xe">
+              <v:shapetype w14:anchorId="577D9C77" id="_x0000_t202" coordsize="21600,21600" o:spt="202" path="m,l,21600r21600,l21600,xe">
                 <v:stroke joinstyle="miter"/>
                 <v:path gradientshapeok="t" o:connecttype="rect"/>
               </v:shapetype>
-              <v:shape id="Text Box 2" o:spid="_x0000_s1026" type="#_x0000_t202" style="position:absolute;margin-left:7.25pt;margin-top:12.4pt;width:120.1pt;height:110.6pt;z-index:-251654144;visibility:visible;mso-wrap-style:square;mso-width-percent:0;mso-height-percent:200;mso-wrap-distance-left:9pt;mso-wrap-distance-top:3.6pt;mso-wrap-distance-right:9pt;mso-wrap-distance-bottom:3.6pt;mso-position-horizontal:absolute;mso-position-horizontal-relative:text;mso-position-vertical:absolute;mso-position-vertical-relative:text;mso-width-percent:0;mso-height-percent:200;mso-width-relative:margin;mso-height-relative:margin;v-text-anchor:top" o:gfxdata="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" fillcolor="white [3212]" strokecolor="white [3212]">
+              <v:shape id="Text Box 2" o:spid="_x0000_s1026" type="#_x0000_t202" style="position:absolute;margin-left:8.9pt;margin-top:.05pt;width:120.1pt;height:110.6pt;z-index:-251653120;visibility:visible;mso-wrap-style:square;mso-width-percent:0;mso-height-percent:200;mso-wrap-distance-left:9pt;mso-wrap-distance-top:3.6pt;mso-wrap-distance-right:9pt;mso-wrap-distance-bottom:3.6pt;mso-position-horizontal:absolute;mso-position-horizontal-relative:text;mso-position-vertical:absolute;mso-position-vertical-relative:text;mso-width-percent:0;mso-height-percent:200;mso-width-relative:margin;mso-height-relative:margin;v-text-anchor:top" o:gfxdata="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" fillcolor="white [3212]" strokecolor="white [3212]">
                 <v:textbox style="mso-fit-shape-to-text:t">
                   <w:txbxContent>
                     <w:p>
@@ -1291,303 +1300,65 @@
           </mc:Fallback>
         </mc:AlternateContent>
       </w:r>
+      <w:r>
+        <w:rPr>
+          <w:rFonts w:ascii="Arial" w:hAnsi="Arial" w:cs="Arial"/>
+          <w:b/>
+        </w:rPr>
+        <w:t>{Employee}</w:t>
+      </w:r>
     </w:p>
     <w:p>
       <w:pPr>
         <w:pStyle w:val="NoSpacing"/>
         <w:rPr>
           <w:rFonts w:ascii="Arial" w:hAnsi="Arial" w:cs="Arial"/>
-          <w:b/>
+          <w:i/>
+        </w:rPr>
+      </w:pPr>
+      <w:r>
+        <w:rPr>
+          <w:rFonts w:ascii="Arial" w:hAnsi="Arial" w:cs="Arial"/>
+          <w:i/>
+        </w:rPr>
+        <w:t>{position}</w:t>
+      </w:r>
+    </w:p>
+    <w:p>
+      <w:pPr>
+        <w:pStyle w:val="NoSpacing"/>
+        <w:rPr>
+          <w:rFonts w:ascii="Arial" w:hAnsi="Arial" w:cs="Arial"/>
           <w:sz w:val="18"/>
           <w:szCs w:val="18"/>
         </w:rPr>
       </w:pPr>
-      <w:r>
-        <w:rPr>
-          <w:rFonts w:ascii="Arial" w:hAnsi="Arial" w:cs="Arial"/>
-          <w:b/>
-          <w:sz w:val="18"/>
-          <w:szCs w:val="18"/>
-        </w:rPr>
-        <w:t>{Employee}</w:t>
-      </w:r>
     </w:p>
     <w:p>
       <w:pPr>
         <w:pStyle w:val="NoSpacing"/>
         <w:rPr>
           <w:rFonts w:ascii="Arial" w:hAnsi="Arial" w:cs="Arial"/>
-          <w:i/>
-          <w:sz w:val="18"/>
-          <w:szCs w:val="18"/>
-        </w:rPr>
-      </w:pPr>
-      <w:r>
-        <w:rPr>
-          <w:rFonts w:ascii="Arial" w:hAnsi="Arial" w:cs="Arial"/>
-          <w:i/>
-          <w:sz w:val="18"/>
-          <w:szCs w:val="18"/>
-        </w:rPr>
-        <w:t>{position}</w:t>
-      </w:r>
-    </w:p>
-    <w:p>
-      <w:pPr>
-        <w:pStyle w:val="NoSpacing"/>
-        <w:rPr>
-          <w:rFonts w:ascii="Arial" w:hAnsi="Arial" w:cs="Arial"/>
-          <w:sz w:val="18"/>
-          <w:szCs w:val="18"/>
-        </w:rPr>
-      </w:pPr>
-    </w:p>
-    <w:p>
-      <w:pPr>
-        <w:pStyle w:val="NoSpacing"/>
-        <w:rPr>
-          <w:rFonts w:ascii="Arial" w:hAnsi="Arial" w:cs="Arial"/>
-          <w:sz w:val="18"/>
-          <w:szCs w:val="18"/>
-        </w:rPr>
-      </w:pPr>
-      <w:r>
-        <w:rPr>
-          <w:rFonts w:ascii="Arial" w:hAnsi="Arial" w:cs="Arial"/>
-          <w:sz w:val="18"/>
-          <w:szCs w:val="18"/>
-        </w:rPr>
-        <w:t>Reviewed by:</w:t>
-      </w:r>
-      <w:r>
-        <w:rPr>
-          <w:rFonts w:ascii="Arial" w:hAnsi="Arial" w:cs="Arial"/>
-          <w:sz w:val="18"/>
-          <w:szCs w:val="18"/>
-        </w:rPr>
-        <w:t xml:space="preserve">                       </w:t>
-      </w:r>
-    </w:p>
-    <w:p>
-      <w:pPr>
-        <w:pStyle w:val="NoSpacing"/>
-        <w:rPr>
-          <w:rFonts w:ascii="Arial" w:hAnsi="Arial" w:cs="Arial"/>
-          <w:b/>
-          <w:sz w:val="18"/>
-          <w:szCs w:val="18"/>
-        </w:rPr>
-      </w:pPr>
-      <w:r>
-        <w:rPr>
-          <w:rFonts w:ascii="Arial" w:hAnsi="Arial" w:cs="Arial"/>
-          <w:b/>
+        </w:rPr>
+      </w:pPr>
+      <w:r>
+        <w:rPr>
+          <w:rFonts w:ascii="Arial" w:hAnsi="Arial" w:cs="Arial"/>
           <w:noProof/>
-          <w:sz w:val="18"/>
-          <w:szCs w:val="18"/>
         </w:rPr>
         <mc:AlternateContent>
           <mc:Choice Requires="wps">
             <w:drawing>
-              <wp:anchor distT="45720" distB="45720" distL="114300" distR="114300" simplePos="0" relativeHeight="251660288" behindDoc="1" locked="0" layoutInCell="1" allowOverlap="1" wp14:anchorId="5FA19321" wp14:editId="549639A5">
+              <wp:anchor distT="45720" distB="45720" distL="114300" distR="114300" simplePos="0" relativeHeight="251659264" behindDoc="1" locked="0" layoutInCell="1" allowOverlap="1" wp14:anchorId="58D766B9" wp14:editId="5A8CA265">
                 <wp:simplePos x="0" y="0"/>
                 <wp:positionH relativeFrom="column">
-                  <wp:posOffset>249769</wp:posOffset>
+                  <wp:posOffset>3189453</wp:posOffset>
                 </wp:positionH>
                 <wp:positionV relativeFrom="paragraph">
-                  <wp:posOffset>23297</wp:posOffset>
+                  <wp:posOffset>4815</wp:posOffset>
                 </wp:positionV>
-                <wp:extent cx="1525509" cy="1404620"/>
-                <wp:effectExtent l="0" t="0" r="17780" b="13970"/>
-                <wp:wrapNone/>
-                <wp:docPr id="2079120568" name="Text Box 2"/>
-                <wp:cNvGraphicFramePr>
-                  <a:graphicFrameLocks xmlns:a="http://schemas.openxmlformats.org/drawingml/2006/main"/>
-                </wp:cNvGraphicFramePr>
-                <a:graphic xmlns:a="http://schemas.openxmlformats.org/drawingml/2006/main">
-                  <a:graphicData uri="http://schemas.microsoft.com/office/word/2010/wordprocessingShape">
-                    <wps:wsp>
-                      <wps:cNvSpPr txBox="1">
-                        <a:spLocks noChangeArrowheads="1"/>
-                      </wps:cNvSpPr>
-                      <wps:spPr bwMode="auto">
-                        <a:xfrm>
-                          <a:off x="0" y="0"/>
-                          <a:ext cx="1525509" cy="1404620"/>
-                        </a:xfrm>
-                        <a:prstGeom prst="rect">
-                          <a:avLst/>
-                        </a:prstGeom>
-                        <a:solidFill>
-                          <a:schemeClr val="bg1"/>
-                        </a:solidFill>
-                        <a:ln w="9525">
-                          <a:solidFill>
-                            <a:schemeClr val="bg1"/>
-                          </a:solidFill>
-                          <a:miter lim="800000"/>
-                          <a:headEnd/>
-                          <a:tailEnd/>
-                        </a:ln>
-                      </wps:spPr>
-                      <wps:txbx>
-                        <w:txbxContent>
-                          <w:p>
-                            <w:pPr>
-                              <w:rPr>
-                                <w:lang w:val="en-US"/>
-                              </w:rPr>
-                            </w:pPr>
-                            <w:r>
-                              <w:rPr>
-                                <w:lang w:val="en-US"/>
-                              </w:rPr>
-                              <w:t>{</w:t>
-                            </w:r>
-                            <w:proofErr w:type="spellStart"/>
-                            <w:r>
-                              <w:rPr>
-                                <w:lang w:val="en-US"/>
-                              </w:rPr>
-                              <w:t>reviewedBySignature</w:t>
-                            </w:r>
-                            <w:proofErr w:type="spellEnd"/>
-                            <w:r>
-                              <w:rPr>
-                                <w:lang w:val="en-US"/>
-                              </w:rPr>
-                              <w:t xml:space="preserve">} </w:t>
-                            </w:r>
-                          </w:p>
-                          <w:p/>
-                        </w:txbxContent>
-                      </wps:txbx>
-                      <wps:bodyPr rot="0" vert="horz" wrap="square" lIns="91440" tIns="45720" rIns="91440" bIns="45720" anchor="t" anchorCtr="0">
-                        <a:spAutoFit/>
-                      </wps:bodyPr>
-                    </wps:wsp>
-                  </a:graphicData>
-                </a:graphic>
-                <wp14:sizeRelH relativeFrom="margin">
-                  <wp14:pctWidth>0</wp14:pctWidth>
-                </wp14:sizeRelH>
-                <wp14:sizeRelV relativeFrom="margin">
-                  <wp14:pctHeight>20000</wp14:pctHeight>
-                </wp14:sizeRelV>
-              </wp:anchor>
-            </w:drawing>
-          </mc:Choice>
-          <mc:Fallback>
-            <w:pict>
-              <v:shape w14:anchorId="5FA19321" id="_x0000_s1027" type="#_x0000_t202" style="position:absolute;margin-left:19.65pt;margin-top:1.85pt;width:120.1pt;height:110.6pt;z-index:-251656192;visibility:visible;mso-wrap-style:square;mso-width-percent:0;mso-height-percent:200;mso-wrap-distance-left:9pt;mso-wrap-distance-top:3.6pt;mso-wrap-distance-right:9pt;mso-wrap-distance-bottom:3.6pt;mso-position-horizontal:absolute;mso-position-horizontal-relative:text;mso-position-vertical:absolute;mso-position-vertical-relative:text;mso-width-percent:0;mso-height-percent:200;mso-width-relative:margin;mso-height-relative:margin;v-text-anchor:top" o:gfxdata="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" fillcolor="white [3212]" strokecolor="white [3212]">
-                <v:textbox style="mso-fit-shape-to-text:t">
-                  <w:txbxContent>
-                    <w:p>
-                      <w:pPr>
-                        <w:rPr>
-                          <w:lang w:val="en-US"/>
-                        </w:rPr>
-                      </w:pPr>
-                      <w:r>
-                        <w:rPr>
-                          <w:lang w:val="en-US"/>
-                        </w:rPr>
-                        <w:t>{</w:t>
-                      </w:r>
-                      <w:proofErr w:type="spellStart"/>
-                      <w:r>
-                        <w:rPr>
-                          <w:lang w:val="en-US"/>
-                        </w:rPr>
-                        <w:t>reviewedBySignature</w:t>
-                      </w:r>
-                      <w:proofErr w:type="spellEnd"/>
-                      <w:r>
-                        <w:rPr>
-                          <w:lang w:val="en-US"/>
-                        </w:rPr>
-                        <w:t xml:space="preserve">} </w:t>
-                      </w:r>
-                    </w:p>
-                    <w:p/>
-                  </w:txbxContent>
-                </v:textbox>
-              </v:shape>
-            </w:pict>
-          </mc:Fallback>
-        </mc:AlternateContent>
-      </w:r>
-    </w:p>
-    <w:p>
-      <w:pPr>
-        <w:pStyle w:val="NoSpacing"/>
-        <w:rPr>
-          <w:rFonts w:ascii="Arial" w:hAnsi="Arial" w:cs="Arial"/>
-          <w:b/>
-          <w:sz w:val="18"/>
-          <w:szCs w:val="18"/>
-          <w:u w:val="single"/>
-        </w:rPr>
-      </w:pPr>
-      <w:r>
-        <w:rPr>
-          <w:rFonts w:ascii="Arial" w:hAnsi="Arial" w:cs="Arial"/>
-          <w:b/>
-          <w:sz w:val="18"/>
-          <w:szCs w:val="18"/>
-        </w:rPr>
-        <w:t xml:space="preserve">ATTY. RECHILLE ANN A. MARIANO             </w:t>
-      </w:r>
-    </w:p>
-    <w:p>
-      <w:pPr>
-        <w:pStyle w:val="NoSpacing"/>
-        <w:rPr>
-          <w:rFonts w:ascii="Arial" w:hAnsi="Arial" w:cs="Arial"/>
-          <w:i/>
-          <w:sz w:val="18"/>
-          <w:szCs w:val="18"/>
-        </w:rPr>
-      </w:pPr>
-      <w:r>
-        <w:rPr>
-          <w:rFonts w:ascii="Arial" w:hAnsi="Arial" w:cs="Arial"/>
-          <w:i/>
-          <w:sz w:val="18"/>
-          <w:szCs w:val="18"/>
-        </w:rPr>
-        <w:t>City Administrator</w:t>
-      </w:r>
-    </w:p>
-    <w:p>
-      <w:pPr>
-        <w:pStyle w:val="NoSpacing"/>
-        <w:rPr>
-          <w:rFonts w:ascii="Arial" w:hAnsi="Arial" w:cs="Arial"/>
-          <w:sz w:val="18"/>
-          <w:szCs w:val="18"/>
-        </w:rPr>
-      </w:pPr>
-      <w:r>
-        <w:rPr>
-          <w:rFonts w:ascii="Arial" w:hAnsi="Arial" w:cs="Arial"/>
-          <w:noProof/>
-          <w:sz w:val="18"/>
-          <w:szCs w:val="18"/>
-        </w:rPr>
-        <mc:AlternateContent>
-          <mc:Choice Requires="wps">
-            <w:drawing>
-              <wp:anchor distT="45720" distB="45720" distL="114300" distR="114300" simplePos="0" relativeHeight="251663360" behindDoc="1" locked="0" layoutInCell="1" allowOverlap="1" wp14:anchorId="222E54EC" wp14:editId="667C9D60">
-                <wp:simplePos x="0" y="0"/>
-                <wp:positionH relativeFrom="column">
-                  <wp:posOffset>3209345</wp:posOffset>
-                </wp:positionH>
-                <wp:positionV relativeFrom="paragraph">
-                  <wp:posOffset>87658</wp:posOffset>
-                </wp:positionV>
-                <wp:extent cx="3526404" cy="3140109"/>
-                <wp:effectExtent l="0" t="0" r="17145" b="22225"/>
+                <wp:extent cx="3526404" cy="2157984"/>
+                <wp:effectExtent l="0" t="0" r="17145" b="13970"/>
                 <wp:wrapNone/>
                 <wp:docPr id="908471928" name="Text Box 2"/>
                 <wp:cNvGraphicFramePr>
@@ -1602,7 +1373,7 @@
                       <wps:spPr bwMode="auto">
                         <a:xfrm>
                           <a:off x="0" y="0"/>
-                          <a:ext cx="3526404" cy="3140109"/>
+                          <a:ext cx="3526404" cy="2157984"/>
                         </a:xfrm>
                         <a:prstGeom prst="rect">
                           <a:avLst/>
@@ -1812,7 +1583,7 @@
           </mc:Choice>
           <mc:Fallback>
             <w:pict>
-              <v:shape w14:anchorId="222E54EC" id="_x0000_s1028" type="#_x0000_t202" style="position:absolute;margin-left:252.7pt;margin-top:6.9pt;width:277.65pt;height:247.25pt;z-index:-251653120;visibility:visible;mso-wrap-style:square;mso-width-percent:0;mso-height-percent:0;mso-wrap-distance-left:9pt;mso-wrap-distance-top:3.6pt;mso-wrap-distance-right:9pt;mso-wrap-distance-bottom:3.6pt;mso-position-horizontal:absolute;mso-position-horizontal-relative:text;mso-position-vertical:absolute;mso-position-vertical-relative:text;mso-width-percent:0;mso-height-percent:0;mso-width-relative:margin;mso-height-relative:margin;v-text-anchor:top" o:gfxdata="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" strokecolor="white [3212]">
+              <v:shape w14:anchorId="58D766B9" id="_x0000_s1027" type="#_x0000_t202" style="position:absolute;margin-left:251.15pt;margin-top:.4pt;width:277.65pt;height:169.9pt;z-index:-251657216;visibility:visible;mso-wrap-style:square;mso-width-percent:0;mso-height-percent:0;mso-wrap-distance-left:9pt;mso-wrap-distance-top:3.6pt;mso-wrap-distance-right:9pt;mso-wrap-distance-bottom:3.6pt;mso-position-horizontal:absolute;mso-position-horizontal-relative:text;mso-position-vertical:absolute;mso-position-vertical-relative:text;mso-width-percent:0;mso-height-percent:0;mso-width-relative:margin;mso-height-relative:margin;v-text-anchor:top" o:gfxdata="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" strokecolor="white [3212]">
                 <v:textbox>
                   <w:txbxContent>
                     <w:p>
@@ -1994,29 +1765,11 @@
           </mc:Fallback>
         </mc:AlternateContent>
       </w:r>
-    </w:p>
-    <w:p>
-      <w:pPr>
-        <w:rPr>
-          <w:sz w:val="18"/>
-          <w:szCs w:val="18"/>
-        </w:rPr>
-      </w:pPr>
-      <w:r>
-        <w:rPr>
-          <w:rFonts w:ascii="Arial" w:hAnsi="Arial" w:cs="Arial"/>
-          <w:sz w:val="18"/>
-          <w:szCs w:val="18"/>
-        </w:rPr>
-        <w:t>Recommending Approval</w:t>
-      </w:r>
-      <w:r>
-        <w:rPr>
-          <w:rFonts w:ascii="Arial" w:hAnsi="Arial" w:cs="Arial"/>
-          <w:sz w:val="18"/>
-          <w:szCs w:val="18"/>
-        </w:rPr>
-        <w:t xml:space="preserve">                                               </w:t>
+      <w:r>
+        <w:rPr>
+          <w:rFonts w:ascii="Arial" w:hAnsi="Arial" w:cs="Arial"/>
+        </w:rPr>
+        <w:t xml:space="preserve">Reviewed by:                       </w:t>
       </w:r>
     </w:p>
     <w:p>
@@ -2040,7 +1793,208 @@
         <mc:AlternateContent>
           <mc:Choice Requires="wps">
             <w:drawing>
-              <wp:anchor distT="45720" distB="45720" distL="114300" distR="114300" simplePos="0" relativeHeight="251659264" behindDoc="1" locked="0" layoutInCell="1" allowOverlap="1" wp14:anchorId="55AE5C31" wp14:editId="1D13A85B">
+              <wp:anchor distT="45720" distB="45720" distL="114300" distR="114300" simplePos="0" relativeHeight="251661312" behindDoc="1" locked="0" layoutInCell="1" allowOverlap="1" wp14:anchorId="603ED8B4" wp14:editId="660C4D53">
+                <wp:simplePos x="0" y="0"/>
+                <wp:positionH relativeFrom="column">
+                  <wp:posOffset>249769</wp:posOffset>
+                </wp:positionH>
+                <wp:positionV relativeFrom="paragraph">
+                  <wp:posOffset>23297</wp:posOffset>
+                </wp:positionV>
+                <wp:extent cx="1525509" cy="1404620"/>
+                <wp:effectExtent l="0" t="0" r="17780" b="13970"/>
+                <wp:wrapNone/>
+                <wp:docPr id="2079120568" name="Text Box 2"/>
+                <wp:cNvGraphicFramePr>
+                  <a:graphicFrameLocks xmlns:a="http://schemas.openxmlformats.org/drawingml/2006/main"/>
+                </wp:cNvGraphicFramePr>
+                <a:graphic xmlns:a="http://schemas.openxmlformats.org/drawingml/2006/main">
+                  <a:graphicData uri="http://schemas.microsoft.com/office/word/2010/wordprocessingShape">
+                    <wps:wsp>
+                      <wps:cNvSpPr txBox="1">
+                        <a:spLocks noChangeArrowheads="1"/>
+                      </wps:cNvSpPr>
+                      <wps:spPr bwMode="auto">
+                        <a:xfrm>
+                          <a:off x="0" y="0"/>
+                          <a:ext cx="1525509" cy="1404620"/>
+                        </a:xfrm>
+                        <a:prstGeom prst="rect">
+                          <a:avLst/>
+                        </a:prstGeom>
+                        <a:solidFill>
+                          <a:schemeClr val="bg1"/>
+                        </a:solidFill>
+                        <a:ln w="9525">
+                          <a:solidFill>
+                            <a:schemeClr val="bg1"/>
+                          </a:solidFill>
+                          <a:miter lim="800000"/>
+                          <a:headEnd/>
+                          <a:tailEnd/>
+                        </a:ln>
+                      </wps:spPr>
+                      <wps:txbx>
+                        <w:txbxContent>
+                          <w:p>
+                            <w:pPr>
+                              <w:rPr>
+                                <w:lang w:val="en-US"/>
+                              </w:rPr>
+                            </w:pPr>
+                            <w:r>
+                              <w:rPr>
+                                <w:lang w:val="en-US"/>
+                              </w:rPr>
+                              <w:t>{</w:t>
+                            </w:r>
+                            <w:proofErr w:type="spellStart"/>
+                            <w:r>
+                              <w:rPr>
+                                <w:lang w:val="en-US"/>
+                              </w:rPr>
+                              <w:t>reviewedBySignature</w:t>
+                            </w:r>
+                            <w:proofErr w:type="spellEnd"/>
+                            <w:r>
+                              <w:rPr>
+                                <w:lang w:val="en-US"/>
+                              </w:rPr>
+                              <w:t xml:space="preserve">} </w:t>
+                            </w:r>
+                          </w:p>
+                          <w:p/>
+                        </w:txbxContent>
+                      </wps:txbx>
+                      <wps:bodyPr rot="0" vert="horz" wrap="square" lIns="91440" tIns="45720" rIns="91440" bIns="45720" anchor="t" anchorCtr="0">
+                        <a:spAutoFit/>
+                      </wps:bodyPr>
+                    </wps:wsp>
+                  </a:graphicData>
+                </a:graphic>
+                <wp14:sizeRelH relativeFrom="margin">
+                  <wp14:pctWidth>0</wp14:pctWidth>
+                </wp14:sizeRelH>
+                <wp14:sizeRelV relativeFrom="margin">
+                  <wp14:pctHeight>20000</wp14:pctHeight>
+                </wp14:sizeRelV>
+              </wp:anchor>
+            </w:drawing>
+          </mc:Choice>
+          <mc:Fallback>
+            <w:pict>
+              <v:shape w14:anchorId="603ED8B4" id="_x0000_s1028" type="#_x0000_t202" style="position:absolute;margin-left:19.65pt;margin-top:1.85pt;width:120.1pt;height:110.6pt;z-index:-251655168;visibility:visible;mso-wrap-style:square;mso-width-percent:0;mso-height-percent:200;mso-wrap-distance-left:9pt;mso-wrap-distance-top:3.6pt;mso-wrap-distance-right:9pt;mso-wrap-distance-bottom:3.6pt;mso-position-horizontal:absolute;mso-position-horizontal-relative:text;mso-position-vertical:absolute;mso-position-vertical-relative:text;mso-width-percent:0;mso-height-percent:200;mso-width-relative:margin;mso-height-relative:margin;v-text-anchor:top" o:gfxdata="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" fillcolor="white [3212]" strokecolor="white [3212]">
+                <v:textbox style="mso-fit-shape-to-text:t">
+                  <w:txbxContent>
+                    <w:p>
+                      <w:pPr>
+                        <w:rPr>
+                          <w:lang w:val="en-US"/>
+                        </w:rPr>
+                      </w:pPr>
+                      <w:r>
+                        <w:rPr>
+                          <w:lang w:val="en-US"/>
+                        </w:rPr>
+                        <w:t>{</w:t>
+                      </w:r>
+                      <w:proofErr w:type="spellStart"/>
+                      <w:r>
+                        <w:rPr>
+                          <w:lang w:val="en-US"/>
+                        </w:rPr>
+                        <w:t>reviewedBySignature</w:t>
+                      </w:r>
+                      <w:proofErr w:type="spellEnd"/>
+                      <w:r>
+                        <w:rPr>
+                          <w:lang w:val="en-US"/>
+                        </w:rPr>
+                        <w:t xml:space="preserve">} </w:t>
+                      </w:r>
+                    </w:p>
+                    <w:p/>
+                  </w:txbxContent>
+                </v:textbox>
+              </v:shape>
+            </w:pict>
+          </mc:Fallback>
+        </mc:AlternateContent>
+      </w:r>
+    </w:p>
+    <w:p>
+      <w:pPr>
+        <w:pStyle w:val="NoSpacing"/>
+        <w:rPr>
+          <w:rFonts w:ascii="Arial" w:hAnsi="Arial" w:cs="Arial"/>
+          <w:b/>
+          <w:u w:val="single"/>
+        </w:rPr>
+      </w:pPr>
+      <w:r>
+        <w:rPr>
+          <w:rFonts w:ascii="Arial" w:hAnsi="Arial" w:cs="Arial"/>
+          <w:b/>
+        </w:rPr>
+        <w:t xml:space="preserve">ATTY. RECHILLE ANN A. MARIANO             </w:t>
+      </w:r>
+    </w:p>
+    <w:p>
+      <w:pPr>
+        <w:pStyle w:val="NoSpacing"/>
+        <w:rPr>
+          <w:rFonts w:ascii="Arial" w:hAnsi="Arial" w:cs="Arial"/>
+          <w:i/>
+        </w:rPr>
+      </w:pPr>
+      <w:r>
+        <w:rPr>
+          <w:rFonts w:ascii="Arial" w:hAnsi="Arial" w:cs="Arial"/>
+          <w:i/>
+        </w:rPr>
+        <w:t>City Administrator</w:t>
+      </w:r>
+    </w:p>
+    <w:p>
+      <w:pPr>
+        <w:pStyle w:val="NoSpacing"/>
+        <w:rPr>
+          <w:rFonts w:ascii="Arial" w:hAnsi="Arial" w:cs="Arial"/>
+          <w:sz w:val="18"/>
+          <w:szCs w:val="18"/>
+        </w:rPr>
+      </w:pPr>
+    </w:p>
+    <w:p>
+      <w:r>
+        <w:rPr>
+          <w:rFonts w:ascii="Arial" w:hAnsi="Arial" w:cs="Arial"/>
+        </w:rPr>
+        <w:t xml:space="preserve">Recommending Approval                                               </w:t>
+      </w:r>
+    </w:p>
+    <w:p>
+      <w:pPr>
+        <w:pStyle w:val="NoSpacing"/>
+        <w:rPr>
+          <w:rFonts w:ascii="Arial" w:hAnsi="Arial" w:cs="Arial"/>
+          <w:b/>
+          <w:sz w:val="18"/>
+          <w:szCs w:val="18"/>
+        </w:rPr>
+      </w:pPr>
+      <w:r>
+        <w:rPr>
+          <w:rFonts w:ascii="Arial" w:hAnsi="Arial" w:cs="Arial"/>
+          <w:b/>
+          <w:noProof/>
+          <w:sz w:val="18"/>
+          <w:szCs w:val="18"/>
+        </w:rPr>
+        <mc:AlternateContent>
+          <mc:Choice Requires="wps">
+            <w:drawing>
+              <wp:anchor distT="45720" distB="45720" distL="114300" distR="114300" simplePos="0" relativeHeight="251660288" behindDoc="1" locked="0" layoutInCell="1" allowOverlap="1" wp14:anchorId="00FF647D" wp14:editId="60BEC223">
                 <wp:simplePos x="0" y="0"/>
                 <wp:positionH relativeFrom="column">
                   <wp:posOffset>64126</wp:posOffset>
@@ -2130,7 +2084,7 @@
           </mc:Choice>
           <mc:Fallback>
             <w:pict>
-              <v:shape w14:anchorId="55AE5C31" id="_x0000_s1029" type="#_x0000_t202" style="position:absolute;margin-left:5.05pt;margin-top:3.7pt;width:156.1pt;height:110.6pt;z-index:-251657216;visibility:visible;mso-wrap-style:square;mso-width-percent:0;mso-height-percent:200;mso-wrap-distance-left:9pt;mso-wrap-distance-top:3.6pt;mso-wrap-distance-right:9pt;mso-wrap-distance-bottom:3.6pt;mso-position-horizontal:absolute;mso-position-horizontal-relative:text;mso-position-vertical:absolute;mso-position-vertical-relative:text;mso-width-percent:0;mso-height-percent:200;mso-width-relative:margin;mso-height-relative:margin;v-text-anchor:top" o:gfxdata="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" fillcolor="white [3212]" strokecolor="white [3212]">
+              <v:shape w14:anchorId="00FF647D" id="_x0000_s1029" type="#_x0000_t202" style="position:absolute;margin-left:5.05pt;margin-top:3.7pt;width:156.1pt;height:110.6pt;z-index:-251656192;visibility:visible;mso-wrap-style:square;mso-width-percent:0;mso-height-percent:200;mso-wrap-distance-left:9pt;mso-wrap-distance-top:3.6pt;mso-wrap-distance-right:9pt;mso-wrap-distance-bottom:3.6pt;mso-position-horizontal:absolute;mso-position-horizontal-relative:text;mso-position-vertical:absolute;mso-position-vertical-relative:text;mso-width-percent:0;mso-height-percent:200;mso-width-relative:margin;mso-height-relative:margin;v-text-anchor:top" o:gfxdata="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" fillcolor="white [3212]" strokecolor="white [3212]">
                 <v:textbox style="mso-fit-shape-to-text:t">
                   <w:txbxContent>
                     <w:p>
@@ -2170,63 +2124,65 @@
       </w:r>
     </w:p>
     <w:p>
-      <w:pPr>
-        <w:rPr>
+      <w:r>
+        <w:rPr>
+          <w:rFonts w:ascii="Arial" w:hAnsi="Arial" w:cs="Arial"/>
+          <w:b/>
+        </w:rPr>
+        <w:t xml:space="preserve">MARIBELLE J. ARTIENDA                          </w:t>
+      </w:r>
+    </w:p>
+    <w:p>
+      <w:pPr>
+        <w:pStyle w:val="NoSpacing"/>
+        <w:rPr>
+          <w:rFonts w:ascii="Arial" w:hAnsi="Arial" w:cs="Arial"/>
+          <w:b/>
+        </w:rPr>
+      </w:pPr>
+      <w:r>
+        <w:rPr>
+          <w:rFonts w:ascii="Arial" w:hAnsi="Arial" w:cs="Arial"/>
+          <w:i/>
+          <w:iCs/>
+        </w:rPr>
+        <w:t xml:space="preserve">City Social Welfare &amp; </w:t>
+      </w:r>
+      <w:proofErr w:type="spellStart"/>
+      <w:r>
+        <w:rPr>
+          <w:rFonts w:ascii="Arial" w:hAnsi="Arial" w:cs="Arial"/>
+          <w:i/>
+          <w:iCs/>
+        </w:rPr>
+        <w:t>Dev’t</w:t>
+      </w:r>
+      <w:proofErr w:type="spellEnd"/>
+      <w:r>
+        <w:rPr>
+          <w:rFonts w:ascii="Arial" w:hAnsi="Arial" w:cs="Arial"/>
+          <w:i/>
+          <w:iCs/>
+        </w:rPr>
+        <w:t xml:space="preserve">. Officer                              </w:t>
+      </w:r>
+    </w:p>
+    <w:p>
+      <w:pPr>
+        <w:pStyle w:val="NoSpacing"/>
+        <w:rPr>
+          <w:rFonts w:ascii="Arial" w:hAnsi="Arial" w:cs="Arial"/>
           <w:sz w:val="18"/>
           <w:szCs w:val="18"/>
         </w:rPr>
       </w:pPr>
-      <w:r>
-        <w:rPr>
-          <w:rFonts w:ascii="Arial" w:hAnsi="Arial" w:cs="Arial"/>
-          <w:b/>
-          <w:sz w:val="18"/>
-          <w:szCs w:val="18"/>
-        </w:rPr>
-        <w:t xml:space="preserve">MARIBELLE J. ARTIENDA                          </w:t>
-      </w:r>
     </w:p>
     <w:p>
-      <w:pPr>
-        <w:pStyle w:val="NoSpacing"/>
-        <w:rPr>
-          <w:rFonts w:ascii="Arial" w:hAnsi="Arial" w:cs="Arial"/>
-          <w:b/>
-          <w:sz w:val="18"/>
-          <w:szCs w:val="18"/>
-        </w:rPr>
-      </w:pPr>
-      <w:r>
-        <w:rPr>
-          <w:rFonts w:ascii="Arial" w:hAnsi="Arial" w:cs="Arial"/>
-          <w:i/>
-          <w:iCs/>
-          <w:sz w:val="18"/>
-          <w:szCs w:val="18"/>
-        </w:rPr>
-        <w:t xml:space="preserve">City Social Welfare &amp; </w:t>
-      </w:r>
-      <w:proofErr w:type="spellStart"/>
-      <w:r>
-        <w:rPr>
-          <w:rFonts w:ascii="Arial" w:hAnsi="Arial" w:cs="Arial"/>
-          <w:i/>
-          <w:iCs/>
-          <w:sz w:val="18"/>
-          <w:szCs w:val="18"/>
-        </w:rPr>
-        <w:t>Dev’t</w:t>
-      </w:r>
-      <w:proofErr w:type="spellEnd"/>
-      <w:r>
-        <w:rPr>
-          <w:rFonts w:ascii="Arial" w:hAnsi="Arial" w:cs="Arial"/>
-          <w:i/>
-          <w:iCs/>
-          <w:sz w:val="18"/>
-          <w:szCs w:val="18"/>
-        </w:rPr>
-        <w:t xml:space="preserve">. Officer                              </w:t>
+      <w:r>
+        <w:rPr>
+          <w:rFonts w:ascii="Arial" w:hAnsi="Arial" w:cs="Arial"/>
+        </w:rPr>
+        <w:t xml:space="preserve">APPROVED:                                                       </w:t>
       </w:r>
     </w:p>
     <w:p>
@@ -2234,35 +2190,7 @@
         <w:pStyle w:val="NoSpacing"/>
         <w:rPr>
           <w:rFonts w:ascii="Arial" w:hAnsi="Arial" w:cs="Arial"/>
-          <w:sz w:val="18"/>
-          <w:szCs w:val="18"/>
-        </w:rPr>
-      </w:pPr>
-    </w:p>
-    <w:p>
-      <w:pPr>
-        <w:rPr>
-          <w:sz w:val="18"/>
-          <w:szCs w:val="18"/>
-        </w:rPr>
-      </w:pPr>
-      <w:r>
-        <w:rPr>
-          <w:rFonts w:ascii="Arial" w:hAnsi="Arial" w:cs="Arial"/>
-          <w:sz w:val="18"/>
-          <w:szCs w:val="18"/>
-        </w:rPr>
-        <w:t xml:space="preserve">APPROVED:                                                       </w:t>
-      </w:r>
-    </w:p>
-    <w:p>
-      <w:pPr>
-        <w:pStyle w:val="NoSpacing"/>
-        <w:rPr>
-          <w:rFonts w:ascii="Arial" w:hAnsi="Arial" w:cs="Arial"/>
-          <w:b/>
-          <w:sz w:val="18"/>
-          <w:szCs w:val="18"/>
+          <w:b/>
         </w:rPr>
       </w:pPr>
       <w:r>
@@ -2270,13 +2198,11 @@
           <w:rFonts w:ascii="Arial" w:hAnsi="Arial" w:cs="Arial"/>
           <w:b/>
           <w:noProof/>
-          <w:sz w:val="18"/>
-          <w:szCs w:val="18"/>
         </w:rPr>
         <mc:AlternateContent>
           <mc:Choice Requires="wps">
             <w:drawing>
-              <wp:anchor distT="45720" distB="45720" distL="114300" distR="114300" simplePos="0" relativeHeight="251661312" behindDoc="1" locked="0" layoutInCell="1" allowOverlap="1" wp14:anchorId="162E7BC2" wp14:editId="104E8D02">
+              <wp:anchor distT="45720" distB="45720" distL="114300" distR="114300" simplePos="0" relativeHeight="251662336" behindDoc="1" locked="0" layoutInCell="1" allowOverlap="1" wp14:anchorId="112A916F" wp14:editId="291A10AA">
                 <wp:simplePos x="0" y="0"/>
                 <wp:positionH relativeFrom="column">
                   <wp:posOffset>472473</wp:posOffset>
@@ -2366,7 +2292,7 @@
           </mc:Choice>
           <mc:Fallback>
             <w:pict>
-              <v:shape w14:anchorId="162E7BC2" id="_x0000_s1030" type="#_x0000_t202" style="position:absolute;margin-left:37.2pt;margin-top:.7pt;width:146.85pt;height:110.6pt;z-index:-251655168;visibility:visible;mso-wrap-style:square;mso-width-percent:0;mso-height-percent:200;mso-wrap-distance-left:9pt;mso-wrap-distance-top:3.6pt;mso-wrap-distance-right:9pt;mso-wrap-distance-bottom:3.6pt;mso-position-horizontal:absolute;mso-position-horizontal-relative:text;mso-position-vertical:absolute;mso-position-vertical-relative:text;mso-width-percent:0;mso-height-percent:200;mso-width-relative:margin;mso-height-relative:margin;v-text-anchor:top" o:gfxdata="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" fillcolor="white [3212]" strokecolor="white [3212]">
+              <v:shape w14:anchorId="112A916F" id="_x0000_s1030" type="#_x0000_t202" style="position:absolute;margin-left:37.2pt;margin-top:.7pt;width:146.85pt;height:110.6pt;z-index:-251654144;visibility:visible;mso-wrap-style:square;mso-width-percent:0;mso-height-percent:200;mso-wrap-distance-left:9pt;mso-wrap-distance-top:3.6pt;mso-wrap-distance-right:9pt;mso-wrap-distance-bottom:3.6pt;mso-position-horizontal:absolute;mso-position-horizontal-relative:text;mso-position-vertical:absolute;mso-position-vertical-relative:text;mso-width-percent:0;mso-height-percent:200;mso-width-relative:margin;mso-height-relative:margin;v-text-anchor:top" o:gfxdata="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" fillcolor="white [3212]" strokecolor="white [3212]">
                 <v:textbox style="mso-fit-shape-to-text:t">
                   <w:txbxContent>
                     <w:p>
@@ -2408,8 +2334,6 @@
         <w:rPr>
           <w:rFonts w:ascii="Arial" w:hAnsi="Arial" w:cs="Arial"/>
           <w:b/>
-          <w:sz w:val="18"/>
-          <w:szCs w:val="18"/>
         </w:rPr>
         <w:t xml:space="preserve">HON. RANDOLF “RANDY” V. SINGSON            </w:t>
       </w:r>
@@ -2419,50 +2343,14 @@
         <w:rPr>
           <w:rFonts w:ascii="Arial" w:hAnsi="Arial" w:cs="Arial"/>
           <w:i/>
-          <w:sz w:val="23"/>
-          <w:szCs w:val="23"/>
         </w:rPr>
       </w:pPr>
       <w:r>
         <w:rPr>
           <w:rFonts w:ascii="Arial" w:hAnsi="Arial" w:cs="Arial"/>
           <w:i/>
-          <w:sz w:val="18"/>
-          <w:szCs w:val="18"/>
-        </w:rPr>
-        <w:t>City Mayor</w:t>
-      </w:r>
-      <w:r>
-        <w:rPr>
-          <w:rFonts w:ascii="Arial" w:hAnsi="Arial" w:cs="Arial"/>
-          <w:i/>
-          <w:sz w:val="23"/>
-          <w:szCs w:val="23"/>
-        </w:rPr>
-        <w:t xml:space="preserve">                                               </w:t>
-      </w:r>
-    </w:p>
-    <w:p>
-      <w:pPr>
-        <w:rPr>
-          <w:sz w:val="10"/>
-          <w:szCs w:val="10"/>
-        </w:rPr>
-      </w:pPr>
-    </w:p>
-    <w:p>
-      <w:pPr>
-        <w:rPr>
-          <w:sz w:val="16"/>
-          <w:szCs w:val="16"/>
-        </w:rPr>
-      </w:pPr>
-      <w:r>
-        <w:rPr>
-          <w:sz w:val="16"/>
-          <w:szCs w:val="16"/>
-        </w:rPr>
-        <w:t xml:space="preserve">                                   </w:t>
+        </w:rPr>
+        <w:t xml:space="preserve">City Mayor                                               </w:t>
       </w:r>
     </w:p>
     <w:p>

</xml_diff>